<commit_message>
Supplementing the comparison of N2, O2, and total dissolved gas values.
</commit_message>
<xml_diff>
--- a/template/template-bbtn-dga.docx
+++ b/template/template-bbtn-dga.docx
@@ -16,10 +16,10 @@
         <w:tblW w:w="5121" w:type="pct"/>
         <w:jc w:val="center"/>
         <w:tblBorders>
-          <w:top w:val="double" w:sz="12" w:space="0" w:color="000000"/>
-          <w:left w:val="double" w:sz="12" w:space="0" w:color="000000"/>
-          <w:bottom w:val="double" w:sz="12" w:space="0" w:color="000000"/>
-          <w:right w:val="double" w:sz="12" w:space="0" w:color="000000"/>
+          <w:top w:val="double" w:sz="6" w:space="0" w:color="000000"/>
+          <w:left w:val="double" w:sz="6" w:space="0" w:color="000000"/>
+          <w:bottom w:val="double" w:sz="6" w:space="0" w:color="000000"/>
+          <w:right w:val="double" w:sz="6" w:space="0" w:color="000000"/>
           <w:insideH w:val="single" w:sz="6" w:space="0" w:color="000000"/>
           <w:insideV w:val="single" w:sz="6" w:space="0" w:color="000000"/>
         </w:tblBorders>
@@ -31,11 +31,11 @@
         <w:tblLook w:val="01E0" w:firstRow="1" w:lastRow="1" w:firstColumn="1" w:lastColumn="1" w:noHBand="0" w:noVBand="0"/>
       </w:tblPr>
       <w:tblGrid>
-        <w:gridCol w:w="2383"/>
-        <w:gridCol w:w="2346"/>
-        <w:gridCol w:w="2798"/>
-        <w:gridCol w:w="470"/>
-        <w:gridCol w:w="1680"/>
+        <w:gridCol w:w="2372"/>
+        <w:gridCol w:w="2335"/>
+        <w:gridCol w:w="2785"/>
+        <w:gridCol w:w="468"/>
+        <w:gridCol w:w="1672"/>
       </w:tblGrid>
       <w:tr>
         <w:trPr>
@@ -1272,6 +1272,10 @@
               <w:t xml:space="preserve"> </w:t>
             </w:r>
             <w:r>
+              <w:rPr>
+                <w:sz w:val="26"/>
+                <w:szCs w:val="26"/>
+              </w:rPr>
               <w:t>{tram}</w:t>
             </w:r>
           </w:p>
@@ -1358,6 +1362,10 @@
               <w:t xml:space="preserve"> </w:t>
             </w:r>
             <w:r>
+              <w:rPr>
+                <w:sz w:val="26"/>
+                <w:szCs w:val="26"/>
+              </w:rPr>
               <w:t>{vi_tri_lap_dat}</w:t>
             </w:r>
           </w:p>
@@ -1495,10 +1503,7 @@
                 <w:sz w:val="26"/>
                 <w:szCs w:val="26"/>
               </w:rPr>
-              <w:t xml:space="preserve">sản xuất (Manufacturer): </w:t>
-            </w:r>
-            <w:r>
-              <w:t>{hang_sx}</w:t>
+              <w:t>sản xuất (Manufacturer): {hang_sx}</w:t>
             </w:r>
           </w:p>
         </w:tc>
@@ -1915,6 +1920,10 @@
               <w:t xml:space="preserve"> </w:t>
             </w:r>
             <w:r>
+              <w:rPr>
+                <w:sz w:val="26"/>
+                <w:szCs w:val="26"/>
+              </w:rPr>
               <w:t>{ngay_lay_mau}</w:t>
             </w:r>
           </w:p>
@@ -1960,10 +1969,7 @@
                 <w:sz w:val="26"/>
                 <w:szCs w:val="26"/>
               </w:rPr>
-              <w:t xml:space="preserve">nghiệm (Purpose of test): </w:t>
-            </w:r>
-            <w:r>
-              <w:t>{ly_do_thi_nghiem}</w:t>
+              <w:t>nghiệm (Purpose of test): {ly_do_thi_nghiem}</w:t>
             </w:r>
           </w:p>
         </w:tc>
@@ -2064,7 +2070,13 @@
                 <w:sz w:val="26"/>
                 <w:szCs w:val="26"/>
               </w:rPr>
-              <w:tab/>
+              <w:t xml:space="preserve"> </w:t>
+            </w:r>
+            <w:r>
+              <w:rPr>
+                <w:sz w:val="26"/>
+                <w:szCs w:val="26"/>
+              </w:rPr>
               <w:t>Độ</w:t>
             </w:r>
             <w:r>
@@ -2102,11 +2114,11 @@
           <w:tcPr>
             <w:tcW w:w="7996" w:type="dxa"/>
             <w:gridSpan w:val="4"/>
-          </w:tcPr>
-          <w:p>
-            <w:pPr>
-              <w:pStyle w:val="TableParagraph"/>
-              <w:spacing w:before="148"/>
+            <w:vAlign w:val="center"/>
+          </w:tcPr>
+          <w:p>
+            <w:pPr>
+              <w:pStyle w:val="TableParagraph"/>
               <w:ind w:left="35"/>
               <w:rPr>
                 <w:b/>
@@ -2206,11 +2218,11 @@
         <w:tc>
           <w:tcPr>
             <w:tcW w:w="1680" w:type="dxa"/>
-          </w:tcPr>
-          <w:p>
-            <w:pPr>
-              <w:pStyle w:val="TableParagraph"/>
-              <w:spacing w:before="22"/>
+            <w:vAlign w:val="center"/>
+          </w:tcPr>
+          <w:p>
+            <w:pPr>
+              <w:pStyle w:val="TableParagraph"/>
               <w:ind w:left="353"/>
               <w:rPr>
                 <w:sz w:val="26"/>
@@ -3229,6 +3241,7 @@
           <w:tcPr>
             <w:tcW w:w="9676" w:type="dxa"/>
             <w:gridSpan w:val="5"/>
+            <w:vAlign w:val="center"/>
           </w:tcPr>
           <w:p>
             <w:pPr>
@@ -3300,6 +3313,7 @@
           <w:tcPr>
             <w:tcW w:w="9676" w:type="dxa"/>
             <w:gridSpan w:val="5"/>
+            <w:vAlign w:val="center"/>
           </w:tcPr>
           <w:p>
             <w:pPr>
@@ -3720,20 +3734,13 @@
                 <w:tab w:val="left" w:pos="6590"/>
               </w:tabs>
               <w:rPr>
-                <w:sz w:val="26"/>
-                <w:szCs w:val="26"/>
-                <w:lang w:val="en-US"/>
-              </w:rPr>
-            </w:pPr>
-            <w:r>
-              <w:rPr>
                 <w:i/>
                 <w:spacing w:val="-2"/>
                 <w:sz w:val="26"/>
                 <w:szCs w:val="26"/>
-              </w:rPr>
-              <w:t xml:space="preserve">               </w:t>
-            </w:r>
+                <w:lang w:val="en-US"/>
+              </w:rPr>
+            </w:pPr>
             <w:r>
               <w:rPr>
                 <w:i/>
@@ -3741,6 +3748,15 @@
                 <w:sz w:val="26"/>
                 <w:szCs w:val="26"/>
               </w:rPr>
+              <w:t xml:space="preserve">               </w:t>
+            </w:r>
+            <w:r>
+              <w:rPr>
+                <w:i/>
+                <w:spacing w:val="-2"/>
+                <w:sz w:val="26"/>
+                <w:szCs w:val="26"/>
+              </w:rPr>
               <w:t>(Testers)</w:t>
             </w:r>
             <w:r>
@@ -3899,17 +3915,29 @@
               <w:rPr>
                 <w:sz w:val="26"/>
                 <w:szCs w:val="26"/>
-              </w:rPr>
-            </w:pPr>
-          </w:p>
-          <w:p>
-            <w:pPr>
-              <w:pStyle w:val="TableParagraph"/>
-              <w:rPr>
-                <w:sz w:val="26"/>
-                <w:szCs w:val="26"/>
-              </w:rPr>
-            </w:pPr>
+                <w:lang w:val="en-US"/>
+              </w:rPr>
+            </w:pPr>
+          </w:p>
+          <w:p>
+            <w:pPr>
+              <w:pStyle w:val="TableParagraph"/>
+              <w:tabs>
+                <w:tab w:val="left" w:pos="7756"/>
+              </w:tabs>
+              <w:rPr>
+                <w:sz w:val="26"/>
+                <w:szCs w:val="26"/>
+              </w:rPr>
+            </w:pPr>
+            <w:r>
+              <w:rPr>
+                <w:sz w:val="26"/>
+                <w:szCs w:val="26"/>
+                <w:lang w:val="en-US"/>
+              </w:rPr>
+              <w:tab/>
+            </w:r>
           </w:p>
           <w:p>
             <w:pPr>
@@ -3950,44 +3978,6 @@
                 <w:szCs w:val="26"/>
               </w:rPr>
               <w:tab/>
-            </w:r>
-            <w:r>
-              <w:rPr>
-                <w:b/>
-                <w:w w:val="95"/>
-                <w:sz w:val="26"/>
-                <w:szCs w:val="26"/>
-              </w:rPr>
-              <w:t>Phạm</w:t>
-            </w:r>
-            <w:r>
-              <w:rPr>
-                <w:b/>
-                <w:spacing w:val="-2"/>
-                <w:w w:val="95"/>
-                <w:sz w:val="26"/>
-                <w:szCs w:val="26"/>
-              </w:rPr>
-              <w:t xml:space="preserve"> </w:t>
-            </w:r>
-            <w:r>
-              <w:rPr>
-                <w:b/>
-                <w:w w:val="95"/>
-                <w:sz w:val="26"/>
-                <w:szCs w:val="26"/>
-              </w:rPr>
-              <w:t xml:space="preserve">Ngọc </w:t>
-            </w:r>
-            <w:r>
-              <w:rPr>
-                <w:b/>
-                <w:spacing w:val="-5"/>
-                <w:w w:val="95"/>
-                <w:sz w:val="26"/>
-                <w:szCs w:val="26"/>
-              </w:rPr>
-              <w:t>Anh</w:t>
             </w:r>
           </w:p>
         </w:tc>
@@ -4005,7 +3995,7 @@
           <w:footerReference w:type="default" r:id="rId8"/>
           <w:type w:val="continuous"/>
           <w:pgSz w:w="11910" w:h="16840" w:code="9"/>
-          <w:pgMar w:top="567" w:right="851" w:bottom="567" w:left="1701" w:header="369" w:footer="335" w:gutter="0"/>
+          <w:pgMar w:top="851" w:right="851" w:bottom="284" w:left="1701" w:header="369" w:footer="335" w:gutter="0"/>
           <w:pgNumType w:start="1"/>
           <w:cols w:space="720"/>
         </w:sectPr>
@@ -4136,20 +4126,15 @@
           <w:p>
             <w:pPr>
               <w:pStyle w:val="TableParagraph"/>
-              <w:spacing w:before="148"/>
               <w:ind w:left="15"/>
               <w:jc w:val="center"/>
               <w:rPr>
-                <w:b/>
-                <w:bCs/>
-                <w:sz w:val="26"/>
-                <w:szCs w:val="26"/>
-              </w:rPr>
-            </w:pPr>
-            <w:r>
-              <w:rPr>
-                <w:b/>
-                <w:bCs/>
+                <w:sz w:val="26"/>
+                <w:szCs w:val="26"/>
+              </w:rPr>
+            </w:pPr>
+            <w:r>
+              <w:rPr>
                 <w:spacing w:val="-5"/>
                 <w:sz w:val="26"/>
                 <w:szCs w:val="26"/>
@@ -4166,20 +4151,14 @@
           <w:p>
             <w:pPr>
               <w:pStyle w:val="TableParagraph"/>
-              <w:spacing w:before="22"/>
               <w:ind w:left="22"/>
-              <w:jc w:val="center"/>
-              <w:rPr>
-                <w:b/>
-                <w:bCs/>
-                <w:sz w:val="26"/>
-                <w:szCs w:val="26"/>
-              </w:rPr>
-            </w:pPr>
-            <w:r>
-              <w:rPr>
-                <w:b/>
-                <w:bCs/>
+              <w:rPr>
+                <w:sz w:val="26"/>
+                <w:szCs w:val="26"/>
+              </w:rPr>
+            </w:pPr>
+            <w:r>
+              <w:rPr>
                 <w:sz w:val="26"/>
                 <w:szCs w:val="26"/>
               </w:rPr>
@@ -4187,8 +4166,6 @@
             </w:r>
             <w:r>
               <w:rPr>
-                <w:b/>
-                <w:bCs/>
                 <w:spacing w:val="-1"/>
                 <w:sz w:val="26"/>
                 <w:szCs w:val="26"/>
@@ -4197,8 +4174,6 @@
             </w:r>
             <w:r>
               <w:rPr>
-                <w:b/>
-                <w:bCs/>
                 <w:sz w:val="26"/>
                 <w:szCs w:val="26"/>
               </w:rPr>
@@ -4206,8 +4181,6 @@
             </w:r>
             <w:r>
               <w:rPr>
-                <w:b/>
-                <w:bCs/>
                 <w:spacing w:val="-4"/>
                 <w:sz w:val="26"/>
                 <w:szCs w:val="26"/>
@@ -4219,10 +4192,7 @@
             <w:pPr>
               <w:pStyle w:val="TableParagraph"/>
               <w:ind w:left="22"/>
-              <w:jc w:val="center"/>
-              <w:rPr>
-                <w:b/>
-                <w:bCs/>
+              <w:rPr>
                 <w:i/>
                 <w:sz w:val="26"/>
                 <w:szCs w:val="26"/>
@@ -4230,8 +4200,6 @@
             </w:pPr>
             <w:r>
               <w:rPr>
-                <w:b/>
-                <w:bCs/>
                 <w:i/>
                 <w:sz w:val="26"/>
                 <w:szCs w:val="26"/>
@@ -4240,8 +4208,6 @@
             </w:r>
             <w:r>
               <w:rPr>
-                <w:b/>
-                <w:bCs/>
                 <w:i/>
                 <w:spacing w:val="-2"/>
                 <w:sz w:val="26"/>
@@ -4259,44 +4225,129 @@
           <w:p>
             <w:pPr>
               <w:pStyle w:val="TableParagraph"/>
-              <w:spacing w:before="22"/>
+              <w:ind w:left="175"/>
+              <w:rPr>
+                <w:sz w:val="26"/>
+                <w:szCs w:val="26"/>
+              </w:rPr>
+            </w:pPr>
+            <w:r>
+              <w:rPr>
+                <w:sz w:val="26"/>
+                <w:szCs w:val="26"/>
+              </w:rPr>
+              <w:t xml:space="preserve">Đơn </w:t>
+            </w:r>
+            <w:r>
+              <w:rPr>
+                <w:spacing w:val="-5"/>
+                <w:sz w:val="26"/>
+                <w:szCs w:val="26"/>
+              </w:rPr>
+              <w:t>vị</w:t>
+            </w:r>
+          </w:p>
+          <w:p>
+            <w:pPr>
+              <w:pStyle w:val="TableParagraph"/>
+              <w:ind w:left="212"/>
+              <w:rPr>
+                <w:i/>
+                <w:sz w:val="26"/>
+                <w:szCs w:val="26"/>
+              </w:rPr>
+            </w:pPr>
+            <w:r>
+              <w:rPr>
+                <w:i/>
+                <w:spacing w:val="-2"/>
+                <w:sz w:val="26"/>
+                <w:szCs w:val="26"/>
+              </w:rPr>
+              <w:t>(Unit)</w:t>
+            </w:r>
+          </w:p>
+        </w:tc>
+        <w:tc>
+          <w:tcPr>
+            <w:tcW w:w="1428" w:type="dxa"/>
+            <w:vAlign w:val="center"/>
+          </w:tcPr>
+          <w:p>
+            <w:pPr>
+              <w:pStyle w:val="TableParagraph"/>
+              <w:ind w:left="368"/>
+              <w:rPr>
+                <w:sz w:val="26"/>
+                <w:szCs w:val="26"/>
+              </w:rPr>
+            </w:pPr>
+            <w:r>
+              <w:rPr>
+                <w:sz w:val="26"/>
+                <w:szCs w:val="26"/>
+              </w:rPr>
+              <w:t xml:space="preserve">Kết </w:t>
+            </w:r>
+            <w:r>
+              <w:rPr>
+                <w:spacing w:val="-5"/>
+                <w:sz w:val="26"/>
+                <w:szCs w:val="26"/>
+              </w:rPr>
+              <w:t>quả</w:t>
+            </w:r>
+          </w:p>
+          <w:p>
+            <w:pPr>
+              <w:pStyle w:val="TableParagraph"/>
+              <w:ind w:left="365"/>
+              <w:rPr>
+                <w:i/>
+                <w:sz w:val="26"/>
+                <w:szCs w:val="26"/>
+              </w:rPr>
+            </w:pPr>
+            <w:r>
+              <w:rPr>
+                <w:i/>
+                <w:spacing w:val="-2"/>
+                <w:sz w:val="26"/>
+                <w:szCs w:val="26"/>
+              </w:rPr>
+              <w:t>(Result)</w:t>
+            </w:r>
+          </w:p>
+        </w:tc>
+        <w:tc>
+          <w:tcPr>
+            <w:tcW w:w="1426" w:type="dxa"/>
+            <w:vAlign w:val="center"/>
+          </w:tcPr>
+          <w:p>
+            <w:pPr>
+              <w:pStyle w:val="TableParagraph"/>
               <w:ind w:left="14"/>
               <w:jc w:val="center"/>
               <w:rPr>
-                <w:b/>
-                <w:bCs/>
-                <w:sz w:val="26"/>
-                <w:szCs w:val="26"/>
-              </w:rPr>
-            </w:pPr>
-            <w:r>
-              <w:rPr>
-                <w:b/>
-                <w:bCs/>
+                <w:sz w:val="26"/>
+                <w:szCs w:val="26"/>
+              </w:rPr>
+            </w:pPr>
+            <w:r>
+              <w:rPr>
+                <w:sz w:val="26"/>
+                <w:szCs w:val="26"/>
+              </w:rPr>
+              <w:t xml:space="preserve">Tiêu </w:t>
+            </w:r>
+            <w:r>
+              <w:rPr>
                 <w:spacing w:val="-2"/>
                 <w:sz w:val="26"/>
                 <w:szCs w:val="26"/>
               </w:rPr>
-              <w:t>Đơn</w:t>
-            </w:r>
-            <w:r>
-              <w:rPr>
-                <w:b/>
-                <w:bCs/>
-                <w:sz w:val="26"/>
-                <w:szCs w:val="26"/>
-              </w:rPr>
-              <w:t xml:space="preserve"> </w:t>
-            </w:r>
-            <w:r>
-              <w:rPr>
-                <w:b/>
-                <w:bCs/>
-                <w:spacing w:val="-5"/>
-                <w:sz w:val="26"/>
-                <w:szCs w:val="26"/>
-              </w:rPr>
-              <w:t>vị</w:t>
+              <w:t>chuẩn</w:t>
             </w:r>
           </w:p>
           <w:p>
@@ -4305,8 +4356,6 @@
               <w:ind w:left="14"/>
               <w:jc w:val="center"/>
               <w:rPr>
-                <w:b/>
-                <w:bCs/>
                 <w:i/>
                 <w:sz w:val="26"/>
                 <w:szCs w:val="26"/>
@@ -4314,63 +4363,126 @@
             </w:pPr>
             <w:r>
               <w:rPr>
-                <w:b/>
-                <w:bCs/>
                 <w:i/>
                 <w:spacing w:val="-2"/>
                 <w:sz w:val="26"/>
                 <w:szCs w:val="26"/>
               </w:rPr>
-              <w:t>(Unit)</w:t>
-            </w:r>
-          </w:p>
-        </w:tc>
-        <w:tc>
-          <w:tcPr>
-            <w:tcW w:w="1428" w:type="dxa"/>
-            <w:vAlign w:val="center"/>
-          </w:tcPr>
-          <w:p>
-            <w:pPr>
-              <w:pStyle w:val="TableParagraph"/>
-              <w:spacing w:before="22"/>
-              <w:ind w:left="14"/>
-              <w:jc w:val="center"/>
-              <w:rPr>
-                <w:b/>
-                <w:bCs/>
-                <w:sz w:val="26"/>
-                <w:szCs w:val="26"/>
-              </w:rPr>
-            </w:pPr>
-            <w:r>
-              <w:rPr>
-                <w:b/>
-                <w:bCs/>
-                <w:sz w:val="26"/>
-                <w:szCs w:val="26"/>
-              </w:rPr>
-              <w:t xml:space="preserve">Kết </w:t>
-            </w:r>
-            <w:r>
-              <w:rPr>
-                <w:b/>
-                <w:bCs/>
+              <w:t>(Limits)</w:t>
+            </w:r>
+          </w:p>
+        </w:tc>
+        <w:tc>
+          <w:tcPr>
+            <w:tcW w:w="1446" w:type="dxa"/>
+            <w:vAlign w:val="center"/>
+          </w:tcPr>
+          <w:p>
+            <w:pPr>
+              <w:pStyle w:val="TableParagraph"/>
+              <w:ind w:left="283" w:right="18" w:hanging="248"/>
+              <w:rPr>
+                <w:sz w:val="26"/>
+                <w:szCs w:val="26"/>
+              </w:rPr>
+            </w:pPr>
+            <w:r>
+              <w:rPr>
+                <w:sz w:val="26"/>
+                <w:szCs w:val="26"/>
+              </w:rPr>
+              <w:t>Tốc</w:t>
+            </w:r>
+            <w:r>
+              <w:rPr>
+                <w:spacing w:val="-13"/>
+                <w:sz w:val="26"/>
+                <w:szCs w:val="26"/>
+              </w:rPr>
+              <w:t xml:space="preserve"> </w:t>
+            </w:r>
+            <w:r>
+              <w:rPr>
+                <w:sz w:val="26"/>
+                <w:szCs w:val="26"/>
+              </w:rPr>
+              <w:t>độ</w:t>
+            </w:r>
+            <w:r>
+              <w:rPr>
+                <w:spacing w:val="-13"/>
+                <w:sz w:val="26"/>
+                <w:szCs w:val="26"/>
+              </w:rPr>
+              <w:t xml:space="preserve"> </w:t>
+            </w:r>
+            <w:r>
+              <w:rPr>
+                <w:sz w:val="26"/>
+                <w:szCs w:val="26"/>
+              </w:rPr>
+              <w:t>sinh</w:t>
+            </w:r>
+            <w:r>
+              <w:rPr>
+                <w:spacing w:val="-13"/>
+                <w:sz w:val="26"/>
+                <w:szCs w:val="26"/>
+              </w:rPr>
+              <w:t xml:space="preserve"> </w:t>
+            </w:r>
+            <w:r>
+              <w:rPr>
+                <w:sz w:val="26"/>
+                <w:szCs w:val="26"/>
+              </w:rPr>
+              <w:t xml:space="preserve">khí </w:t>
+            </w:r>
+            <w:r>
+              <w:rPr>
+                <w:spacing w:val="-2"/>
+                <w:sz w:val="26"/>
+                <w:szCs w:val="26"/>
+              </w:rPr>
+              <w:t>(%/tháng)</w:t>
+            </w:r>
+          </w:p>
+        </w:tc>
+        <w:tc>
+          <w:tcPr>
+            <w:tcW w:w="1450" w:type="dxa"/>
+            <w:vAlign w:val="center"/>
+          </w:tcPr>
+          <w:p>
+            <w:pPr>
+              <w:pStyle w:val="TableParagraph"/>
+              <w:ind w:left="324"/>
+              <w:rPr>
+                <w:sz w:val="26"/>
+                <w:szCs w:val="26"/>
+              </w:rPr>
+            </w:pPr>
+            <w:r>
+              <w:rPr>
+                <w:sz w:val="26"/>
+                <w:szCs w:val="26"/>
+              </w:rPr>
+              <w:t xml:space="preserve">Đánh </w:t>
+            </w:r>
+            <w:r>
+              <w:rPr>
                 <w:spacing w:val="-5"/>
                 <w:sz w:val="26"/>
                 <w:szCs w:val="26"/>
               </w:rPr>
-              <w:t>quả</w:t>
-            </w:r>
-          </w:p>
-          <w:p>
-            <w:pPr>
-              <w:pStyle w:val="TableParagraph"/>
-              <w:ind w:left="14"/>
-              <w:jc w:val="center"/>
-              <w:rPr>
-                <w:b/>
-                <w:bCs/>
+              <w:t>giá</w:t>
+            </w:r>
+          </w:p>
+          <w:p>
+            <w:pPr>
+              <w:pStyle w:val="TableParagraph"/>
+              <w:ind w:left="266"/>
+              <w:rPr>
                 <w:i/>
                 <w:sz w:val="26"/>
                 <w:szCs w:val="26"/>
@@ -4378,235 +4490,6 @@
             </w:pPr>
             <w:r>
               <w:rPr>
-                <w:b/>
-                <w:bCs/>
-                <w:i/>
-                <w:spacing w:val="-2"/>
-                <w:sz w:val="26"/>
-                <w:szCs w:val="26"/>
-              </w:rPr>
-              <w:t>(Result)</w:t>
-            </w:r>
-          </w:p>
-        </w:tc>
-        <w:tc>
-          <w:tcPr>
-            <w:tcW w:w="1426" w:type="dxa"/>
-            <w:vAlign w:val="center"/>
-          </w:tcPr>
-          <w:p>
-            <w:pPr>
-              <w:pStyle w:val="TableParagraph"/>
-              <w:spacing w:before="22"/>
-              <w:ind w:left="14"/>
-              <w:jc w:val="center"/>
-              <w:rPr>
-                <w:b/>
-                <w:bCs/>
-                <w:sz w:val="26"/>
-                <w:szCs w:val="26"/>
-              </w:rPr>
-            </w:pPr>
-            <w:r>
-              <w:rPr>
-                <w:b/>
-                <w:bCs/>
-                <w:sz w:val="26"/>
-                <w:szCs w:val="26"/>
-              </w:rPr>
-              <w:t xml:space="preserve">Tiêu </w:t>
-            </w:r>
-            <w:r>
-              <w:rPr>
-                <w:b/>
-                <w:bCs/>
-                <w:spacing w:val="-2"/>
-                <w:sz w:val="26"/>
-                <w:szCs w:val="26"/>
-              </w:rPr>
-              <w:t>chuẩn</w:t>
-            </w:r>
-          </w:p>
-          <w:p>
-            <w:pPr>
-              <w:pStyle w:val="TableParagraph"/>
-              <w:ind w:left="14"/>
-              <w:jc w:val="center"/>
-              <w:rPr>
-                <w:b/>
-                <w:bCs/>
-                <w:i/>
-                <w:sz w:val="26"/>
-                <w:szCs w:val="26"/>
-              </w:rPr>
-            </w:pPr>
-            <w:r>
-              <w:rPr>
-                <w:b/>
-                <w:bCs/>
-                <w:i/>
-                <w:spacing w:val="-2"/>
-                <w:sz w:val="26"/>
-                <w:szCs w:val="26"/>
-              </w:rPr>
-              <w:t>(Limits)</w:t>
-            </w:r>
-          </w:p>
-        </w:tc>
-        <w:tc>
-          <w:tcPr>
-            <w:tcW w:w="1446" w:type="dxa"/>
-            <w:vAlign w:val="center"/>
-          </w:tcPr>
-          <w:p>
-            <w:pPr>
-              <w:pStyle w:val="TableParagraph"/>
-              <w:spacing w:before="22"/>
-              <w:ind w:left="14"/>
-              <w:jc w:val="center"/>
-              <w:rPr>
-                <w:b/>
-                <w:bCs/>
-                <w:sz w:val="26"/>
-                <w:szCs w:val="26"/>
-              </w:rPr>
-            </w:pPr>
-            <w:r>
-              <w:rPr>
-                <w:b/>
-                <w:bCs/>
-                <w:spacing w:val="-2"/>
-                <w:sz w:val="26"/>
-                <w:szCs w:val="26"/>
-              </w:rPr>
-              <w:t>Tốc</w:t>
-            </w:r>
-            <w:r>
-              <w:rPr>
-                <w:b/>
-                <w:bCs/>
-                <w:spacing w:val="-13"/>
-                <w:sz w:val="26"/>
-                <w:szCs w:val="26"/>
-              </w:rPr>
-              <w:t xml:space="preserve"> </w:t>
-            </w:r>
-            <w:r>
-              <w:rPr>
-                <w:b/>
-                <w:bCs/>
-                <w:sz w:val="26"/>
-                <w:szCs w:val="26"/>
-              </w:rPr>
-              <w:t>độ</w:t>
-            </w:r>
-            <w:r>
-              <w:rPr>
-                <w:b/>
-                <w:bCs/>
-                <w:spacing w:val="-13"/>
-                <w:sz w:val="26"/>
-                <w:szCs w:val="26"/>
-              </w:rPr>
-              <w:t xml:space="preserve"> </w:t>
-            </w:r>
-            <w:r>
-              <w:rPr>
-                <w:b/>
-                <w:bCs/>
-                <w:sz w:val="26"/>
-                <w:szCs w:val="26"/>
-              </w:rPr>
-              <w:t>sinh</w:t>
-            </w:r>
-            <w:r>
-              <w:rPr>
-                <w:b/>
-                <w:bCs/>
-                <w:spacing w:val="-13"/>
-                <w:sz w:val="26"/>
-                <w:szCs w:val="26"/>
-              </w:rPr>
-              <w:t xml:space="preserve"> </w:t>
-            </w:r>
-            <w:r>
-              <w:rPr>
-                <w:b/>
-                <w:bCs/>
-                <w:sz w:val="26"/>
-                <w:szCs w:val="26"/>
-              </w:rPr>
-              <w:t xml:space="preserve">khí </w:t>
-            </w:r>
-            <w:r>
-              <w:rPr>
-                <w:b/>
-                <w:bCs/>
-                <w:i/>
-                <w:iCs/>
-                <w:spacing w:val="-2"/>
-                <w:sz w:val="26"/>
-                <w:szCs w:val="26"/>
-              </w:rPr>
-              <w:t>(%/tháng)</w:t>
-            </w:r>
-          </w:p>
-        </w:tc>
-        <w:tc>
-          <w:tcPr>
-            <w:tcW w:w="1450" w:type="dxa"/>
-            <w:vAlign w:val="center"/>
-          </w:tcPr>
-          <w:p>
-            <w:pPr>
-              <w:pStyle w:val="TableParagraph"/>
-              <w:spacing w:before="22"/>
-              <w:ind w:left="324"/>
-              <w:jc w:val="center"/>
-              <w:rPr>
-                <w:b/>
-                <w:bCs/>
-                <w:sz w:val="26"/>
-                <w:szCs w:val="26"/>
-              </w:rPr>
-            </w:pPr>
-            <w:r>
-              <w:rPr>
-                <w:b/>
-                <w:bCs/>
-                <w:sz w:val="26"/>
-                <w:szCs w:val="26"/>
-              </w:rPr>
-              <w:t xml:space="preserve">Đánh </w:t>
-            </w:r>
-            <w:r>
-              <w:rPr>
-                <w:b/>
-                <w:bCs/>
-                <w:spacing w:val="-5"/>
-                <w:sz w:val="26"/>
-                <w:szCs w:val="26"/>
-              </w:rPr>
-              <w:t>giá</w:t>
-            </w:r>
-          </w:p>
-          <w:p>
-            <w:pPr>
-              <w:pStyle w:val="TableParagraph"/>
-              <w:ind w:left="266"/>
-              <w:jc w:val="center"/>
-              <w:rPr>
-                <w:b/>
-                <w:bCs/>
-                <w:i/>
-                <w:sz w:val="26"/>
-                <w:szCs w:val="26"/>
-              </w:rPr>
-            </w:pPr>
-            <w:r>
-              <w:rPr>
-                <w:b/>
-                <w:bCs/>
                 <w:i/>
                 <w:spacing w:val="-2"/>
                 <w:sz w:val="26"/>
@@ -4624,11 +4507,11 @@
         <w:tc>
           <w:tcPr>
             <w:tcW w:w="485" w:type="dxa"/>
-          </w:tcPr>
-          <w:p>
-            <w:pPr>
-              <w:pStyle w:val="TableParagraph"/>
-              <w:spacing w:before="35"/>
+            <w:vAlign w:val="center"/>
+          </w:tcPr>
+          <w:p>
+            <w:pPr>
+              <w:pStyle w:val="TableParagraph"/>
               <w:ind w:left="15" w:right="1"/>
               <w:jc w:val="center"/>
               <w:rPr>
@@ -4649,11 +4532,11 @@
         <w:tc>
           <w:tcPr>
             <w:tcW w:w="2846" w:type="dxa"/>
-          </w:tcPr>
-          <w:p>
-            <w:pPr>
-              <w:pStyle w:val="TableParagraph"/>
-              <w:spacing w:before="35"/>
+            <w:vAlign w:val="center"/>
+          </w:tcPr>
+          <w:p>
+            <w:pPr>
+              <w:pStyle w:val="TableParagraph"/>
               <w:ind w:left="22"/>
               <w:rPr>
                 <w:sz w:val="26"/>
@@ -4681,65 +4564,65 @@
           <w:tcPr>
             <w:tcW w:w="962" w:type="dxa"/>
             <w:vMerge w:val="restart"/>
-          </w:tcPr>
-          <w:p>
-            <w:pPr>
-              <w:pStyle w:val="TableParagraph"/>
-              <w:rPr>
-                <w:sz w:val="26"/>
-                <w:szCs w:val="26"/>
-              </w:rPr>
-            </w:pPr>
-          </w:p>
-          <w:p>
-            <w:pPr>
-              <w:pStyle w:val="TableParagraph"/>
-              <w:rPr>
-                <w:sz w:val="26"/>
-                <w:szCs w:val="26"/>
-              </w:rPr>
-            </w:pPr>
-          </w:p>
-          <w:p>
-            <w:pPr>
-              <w:pStyle w:val="TableParagraph"/>
-              <w:rPr>
-                <w:sz w:val="26"/>
-                <w:szCs w:val="26"/>
-              </w:rPr>
-            </w:pPr>
-          </w:p>
-          <w:p>
-            <w:pPr>
-              <w:pStyle w:val="TableParagraph"/>
-              <w:rPr>
-                <w:sz w:val="26"/>
-                <w:szCs w:val="26"/>
-              </w:rPr>
-            </w:pPr>
-          </w:p>
-          <w:p>
-            <w:pPr>
-              <w:pStyle w:val="TableParagraph"/>
-              <w:rPr>
-                <w:sz w:val="26"/>
-                <w:szCs w:val="26"/>
-              </w:rPr>
-            </w:pPr>
-          </w:p>
-          <w:p>
-            <w:pPr>
-              <w:pStyle w:val="TableParagraph"/>
-              <w:rPr>
-                <w:sz w:val="26"/>
-                <w:szCs w:val="26"/>
-              </w:rPr>
-            </w:pPr>
-          </w:p>
-          <w:p>
-            <w:pPr>
-              <w:pStyle w:val="TableParagraph"/>
-              <w:spacing w:before="185"/>
+            <w:vAlign w:val="center"/>
+          </w:tcPr>
+          <w:p>
+            <w:pPr>
+              <w:pStyle w:val="TableParagraph"/>
+              <w:rPr>
+                <w:sz w:val="26"/>
+                <w:szCs w:val="26"/>
+              </w:rPr>
+            </w:pPr>
+          </w:p>
+          <w:p>
+            <w:pPr>
+              <w:pStyle w:val="TableParagraph"/>
+              <w:rPr>
+                <w:sz w:val="26"/>
+                <w:szCs w:val="26"/>
+              </w:rPr>
+            </w:pPr>
+          </w:p>
+          <w:p>
+            <w:pPr>
+              <w:pStyle w:val="TableParagraph"/>
+              <w:rPr>
+                <w:sz w:val="26"/>
+                <w:szCs w:val="26"/>
+              </w:rPr>
+            </w:pPr>
+          </w:p>
+          <w:p>
+            <w:pPr>
+              <w:pStyle w:val="TableParagraph"/>
+              <w:rPr>
+                <w:sz w:val="26"/>
+                <w:szCs w:val="26"/>
+              </w:rPr>
+            </w:pPr>
+          </w:p>
+          <w:p>
+            <w:pPr>
+              <w:pStyle w:val="TableParagraph"/>
+              <w:rPr>
+                <w:sz w:val="26"/>
+                <w:szCs w:val="26"/>
+              </w:rPr>
+            </w:pPr>
+          </w:p>
+          <w:p>
+            <w:pPr>
+              <w:pStyle w:val="TableParagraph"/>
+              <w:rPr>
+                <w:sz w:val="26"/>
+                <w:szCs w:val="26"/>
+              </w:rPr>
+            </w:pPr>
+          </w:p>
+          <w:p>
+            <w:pPr>
+              <w:pStyle w:val="TableParagraph"/>
               <w:rPr>
                 <w:sz w:val="26"/>
                 <w:szCs w:val="26"/>
@@ -4768,11 +4651,11 @@
         <w:tc>
           <w:tcPr>
             <w:tcW w:w="1428" w:type="dxa"/>
-          </w:tcPr>
-          <w:p>
-            <w:pPr>
-              <w:pStyle w:val="TableParagraph"/>
-              <w:spacing w:before="35"/>
+            <w:vAlign w:val="center"/>
+          </w:tcPr>
+          <w:p>
+            <w:pPr>
+              <w:pStyle w:val="TableParagraph"/>
               <w:ind w:left="14"/>
               <w:jc w:val="center"/>
               <w:rPr>
@@ -4793,11 +4676,11 @@
         <w:tc>
           <w:tcPr>
             <w:tcW w:w="1426" w:type="dxa"/>
-          </w:tcPr>
-          <w:p>
-            <w:pPr>
-              <w:pStyle w:val="TableParagraph"/>
-              <w:spacing w:before="35"/>
+            <w:vAlign w:val="center"/>
+          </w:tcPr>
+          <w:p>
+            <w:pPr>
+              <w:pStyle w:val="TableParagraph"/>
               <w:ind w:left="14"/>
               <w:jc w:val="center"/>
               <w:rPr>
@@ -4817,6 +4700,7 @@
         <w:tc>
           <w:tcPr>
             <w:tcW w:w="1446" w:type="dxa"/>
+            <w:vAlign w:val="center"/>
           </w:tcPr>
           <w:p>
             <w:pPr>
@@ -4834,11 +4718,11 @@
         <w:tc>
           <w:tcPr>
             <w:tcW w:w="1450" w:type="dxa"/>
-          </w:tcPr>
-          <w:p>
-            <w:pPr>
-              <w:pStyle w:val="TableParagraph"/>
-              <w:spacing w:before="35"/>
+            <w:vAlign w:val="center"/>
+          </w:tcPr>
+          <w:p>
+            <w:pPr>
+              <w:pStyle w:val="TableParagraph"/>
               <w:ind w:left="15"/>
               <w:jc w:val="center"/>
               <w:rPr>
@@ -4864,11 +4748,11 @@
         <w:tc>
           <w:tcPr>
             <w:tcW w:w="485" w:type="dxa"/>
-          </w:tcPr>
-          <w:p>
-            <w:pPr>
-              <w:pStyle w:val="TableParagraph"/>
-              <w:spacing w:before="35"/>
+            <w:vAlign w:val="center"/>
+          </w:tcPr>
+          <w:p>
+            <w:pPr>
+              <w:pStyle w:val="TableParagraph"/>
               <w:ind w:left="15" w:right="1"/>
               <w:jc w:val="center"/>
               <w:rPr>
@@ -4889,11 +4773,11 @@
         <w:tc>
           <w:tcPr>
             <w:tcW w:w="2846" w:type="dxa"/>
-          </w:tcPr>
-          <w:p>
-            <w:pPr>
-              <w:pStyle w:val="TableParagraph"/>
-              <w:spacing w:before="35"/>
+            <w:vAlign w:val="center"/>
+          </w:tcPr>
+          <w:p>
+            <w:pPr>
+              <w:pStyle w:val="TableParagraph"/>
               <w:ind w:left="22"/>
               <w:rPr>
                 <w:sz w:val="26"/>
@@ -4924,6 +4808,7 @@
             <w:tcBorders>
               <w:top w:val="nil"/>
             </w:tcBorders>
+            <w:vAlign w:val="center"/>
           </w:tcPr>
           <w:p>
             <w:pPr>
@@ -4937,11 +4822,11 @@
         <w:tc>
           <w:tcPr>
             <w:tcW w:w="1428" w:type="dxa"/>
-          </w:tcPr>
-          <w:p>
-            <w:pPr>
-              <w:pStyle w:val="TableParagraph"/>
-              <w:spacing w:before="35"/>
+            <w:vAlign w:val="center"/>
+          </w:tcPr>
+          <w:p>
+            <w:pPr>
+              <w:pStyle w:val="TableParagraph"/>
               <w:ind w:left="14"/>
               <w:jc w:val="center"/>
               <w:rPr>
@@ -4962,11 +4847,11 @@
         <w:tc>
           <w:tcPr>
             <w:tcW w:w="1426" w:type="dxa"/>
-          </w:tcPr>
-          <w:p>
-            <w:pPr>
-              <w:pStyle w:val="TableParagraph"/>
-              <w:spacing w:before="35"/>
+            <w:vAlign w:val="center"/>
+          </w:tcPr>
+          <w:p>
+            <w:pPr>
+              <w:pStyle w:val="TableParagraph"/>
               <w:ind w:left="14"/>
               <w:jc w:val="center"/>
               <w:rPr>
@@ -4986,6 +4871,7 @@
         <w:tc>
           <w:tcPr>
             <w:tcW w:w="1446" w:type="dxa"/>
+            <w:vAlign w:val="center"/>
           </w:tcPr>
           <w:p>
             <w:pPr>
@@ -5003,11 +4889,11 @@
         <w:tc>
           <w:tcPr>
             <w:tcW w:w="1450" w:type="dxa"/>
-          </w:tcPr>
-          <w:p>
-            <w:pPr>
-              <w:pStyle w:val="TableParagraph"/>
-              <w:spacing w:before="35"/>
+            <w:vAlign w:val="center"/>
+          </w:tcPr>
+          <w:p>
+            <w:pPr>
+              <w:pStyle w:val="TableParagraph"/>
               <w:ind w:left="15"/>
               <w:jc w:val="center"/>
               <w:rPr>
@@ -5033,11 +4919,11 @@
         <w:tc>
           <w:tcPr>
             <w:tcW w:w="485" w:type="dxa"/>
-          </w:tcPr>
-          <w:p>
-            <w:pPr>
-              <w:pStyle w:val="TableParagraph"/>
-              <w:spacing w:before="35"/>
+            <w:vAlign w:val="center"/>
+          </w:tcPr>
+          <w:p>
+            <w:pPr>
+              <w:pStyle w:val="TableParagraph"/>
               <w:ind w:left="15" w:right="1"/>
               <w:jc w:val="center"/>
               <w:rPr>
@@ -5058,11 +4944,11 @@
         <w:tc>
           <w:tcPr>
             <w:tcW w:w="2846" w:type="dxa"/>
-          </w:tcPr>
-          <w:p>
-            <w:pPr>
-              <w:pStyle w:val="TableParagraph"/>
-              <w:spacing w:before="35"/>
+            <w:vAlign w:val="center"/>
+          </w:tcPr>
+          <w:p>
+            <w:pPr>
+              <w:pStyle w:val="TableParagraph"/>
               <w:ind w:left="22"/>
               <w:rPr>
                 <w:sz w:val="26"/>
@@ -5093,6 +4979,7 @@
             <w:tcBorders>
               <w:top w:val="nil"/>
             </w:tcBorders>
+            <w:vAlign w:val="center"/>
           </w:tcPr>
           <w:p>
             <w:pPr>
@@ -5106,11 +4993,11 @@
         <w:tc>
           <w:tcPr>
             <w:tcW w:w="1428" w:type="dxa"/>
-          </w:tcPr>
-          <w:p>
-            <w:pPr>
-              <w:pStyle w:val="TableParagraph"/>
-              <w:spacing w:before="35"/>
+            <w:vAlign w:val="center"/>
+          </w:tcPr>
+          <w:p>
+            <w:pPr>
+              <w:pStyle w:val="TableParagraph"/>
               <w:ind w:left="14"/>
               <w:jc w:val="center"/>
               <w:rPr>
@@ -5131,11 +5018,11 @@
         <w:tc>
           <w:tcPr>
             <w:tcW w:w="1426" w:type="dxa"/>
-          </w:tcPr>
-          <w:p>
-            <w:pPr>
-              <w:pStyle w:val="TableParagraph"/>
-              <w:spacing w:before="35"/>
+            <w:vAlign w:val="center"/>
+          </w:tcPr>
+          <w:p>
+            <w:pPr>
+              <w:pStyle w:val="TableParagraph"/>
               <w:ind w:left="14"/>
               <w:jc w:val="center"/>
               <w:rPr>
@@ -5155,6 +5042,7 @@
         <w:tc>
           <w:tcPr>
             <w:tcW w:w="1446" w:type="dxa"/>
+            <w:vAlign w:val="center"/>
           </w:tcPr>
           <w:p>
             <w:pPr>
@@ -5172,11 +5060,11 @@
         <w:tc>
           <w:tcPr>
             <w:tcW w:w="1450" w:type="dxa"/>
-          </w:tcPr>
-          <w:p>
-            <w:pPr>
-              <w:pStyle w:val="TableParagraph"/>
-              <w:spacing w:before="35"/>
+            <w:vAlign w:val="center"/>
+          </w:tcPr>
+          <w:p>
+            <w:pPr>
+              <w:pStyle w:val="TableParagraph"/>
               <w:ind w:left="15"/>
               <w:jc w:val="center"/>
               <w:rPr>
@@ -5202,11 +5090,11 @@
         <w:tc>
           <w:tcPr>
             <w:tcW w:w="485" w:type="dxa"/>
-          </w:tcPr>
-          <w:p>
-            <w:pPr>
-              <w:pStyle w:val="TableParagraph"/>
-              <w:spacing w:before="35"/>
+            <w:vAlign w:val="center"/>
+          </w:tcPr>
+          <w:p>
+            <w:pPr>
+              <w:pStyle w:val="TableParagraph"/>
               <w:ind w:left="15" w:right="1"/>
               <w:jc w:val="center"/>
               <w:rPr>
@@ -5227,11 +5115,11 @@
         <w:tc>
           <w:tcPr>
             <w:tcW w:w="2846" w:type="dxa"/>
-          </w:tcPr>
-          <w:p>
-            <w:pPr>
-              <w:pStyle w:val="TableParagraph"/>
-              <w:spacing w:before="35"/>
+            <w:vAlign w:val="center"/>
+          </w:tcPr>
+          <w:p>
+            <w:pPr>
+              <w:pStyle w:val="TableParagraph"/>
               <w:ind w:left="22"/>
               <w:rPr>
                 <w:sz w:val="26"/>
@@ -5270,6 +5158,7 @@
             <w:tcBorders>
               <w:top w:val="nil"/>
             </w:tcBorders>
+            <w:vAlign w:val="center"/>
           </w:tcPr>
           <w:p>
             <w:pPr>
@@ -5283,11 +5172,11 @@
         <w:tc>
           <w:tcPr>
             <w:tcW w:w="1428" w:type="dxa"/>
-          </w:tcPr>
-          <w:p>
-            <w:pPr>
-              <w:pStyle w:val="TableParagraph"/>
-              <w:spacing w:before="35"/>
+            <w:vAlign w:val="center"/>
+          </w:tcPr>
+          <w:p>
+            <w:pPr>
+              <w:pStyle w:val="TableParagraph"/>
               <w:ind w:left="14"/>
               <w:jc w:val="center"/>
               <w:rPr>
@@ -5308,11 +5197,11 @@
         <w:tc>
           <w:tcPr>
             <w:tcW w:w="1426" w:type="dxa"/>
-          </w:tcPr>
-          <w:p>
-            <w:pPr>
-              <w:pStyle w:val="TableParagraph"/>
-              <w:spacing w:before="35"/>
+            <w:vAlign w:val="center"/>
+          </w:tcPr>
+          <w:p>
+            <w:pPr>
+              <w:pStyle w:val="TableParagraph"/>
               <w:ind w:left="14"/>
               <w:jc w:val="center"/>
               <w:rPr>
@@ -5332,6 +5221,7 @@
         <w:tc>
           <w:tcPr>
             <w:tcW w:w="1446" w:type="dxa"/>
+            <w:vAlign w:val="center"/>
           </w:tcPr>
           <w:p>
             <w:pPr>
@@ -5349,11 +5239,11 @@
         <w:tc>
           <w:tcPr>
             <w:tcW w:w="1450" w:type="dxa"/>
-          </w:tcPr>
-          <w:p>
-            <w:pPr>
-              <w:pStyle w:val="TableParagraph"/>
-              <w:spacing w:before="35"/>
+            <w:vAlign w:val="center"/>
+          </w:tcPr>
+          <w:p>
+            <w:pPr>
+              <w:pStyle w:val="TableParagraph"/>
               <w:ind w:left="15"/>
               <w:jc w:val="center"/>
               <w:rPr>
@@ -5379,11 +5269,11 @@
         <w:tc>
           <w:tcPr>
             <w:tcW w:w="485" w:type="dxa"/>
-          </w:tcPr>
-          <w:p>
-            <w:pPr>
-              <w:pStyle w:val="TableParagraph"/>
-              <w:spacing w:before="35"/>
+            <w:vAlign w:val="center"/>
+          </w:tcPr>
+          <w:p>
+            <w:pPr>
+              <w:pStyle w:val="TableParagraph"/>
               <w:ind w:left="15" w:right="1"/>
               <w:jc w:val="center"/>
               <w:rPr>
@@ -5404,11 +5294,11 @@
         <w:tc>
           <w:tcPr>
             <w:tcW w:w="2846" w:type="dxa"/>
-          </w:tcPr>
-          <w:p>
-            <w:pPr>
-              <w:pStyle w:val="TableParagraph"/>
-              <w:spacing w:before="35"/>
+            <w:vAlign w:val="center"/>
+          </w:tcPr>
+          <w:p>
+            <w:pPr>
+              <w:pStyle w:val="TableParagraph"/>
               <w:ind w:left="22"/>
               <w:rPr>
                 <w:sz w:val="26"/>
@@ -5447,6 +5337,7 @@
             <w:tcBorders>
               <w:top w:val="nil"/>
             </w:tcBorders>
+            <w:vAlign w:val="center"/>
           </w:tcPr>
           <w:p>
             <w:pPr>
@@ -5460,11 +5351,11 @@
         <w:tc>
           <w:tcPr>
             <w:tcW w:w="1428" w:type="dxa"/>
-          </w:tcPr>
-          <w:p>
-            <w:pPr>
-              <w:pStyle w:val="TableParagraph"/>
-              <w:spacing w:before="35"/>
+            <w:vAlign w:val="center"/>
+          </w:tcPr>
+          <w:p>
+            <w:pPr>
+              <w:pStyle w:val="TableParagraph"/>
               <w:ind w:left="14"/>
               <w:jc w:val="center"/>
               <w:rPr>
@@ -5485,11 +5376,11 @@
         <w:tc>
           <w:tcPr>
             <w:tcW w:w="1426" w:type="dxa"/>
-          </w:tcPr>
-          <w:p>
-            <w:pPr>
-              <w:pStyle w:val="TableParagraph"/>
-              <w:spacing w:before="35"/>
+            <w:vAlign w:val="center"/>
+          </w:tcPr>
+          <w:p>
+            <w:pPr>
+              <w:pStyle w:val="TableParagraph"/>
               <w:ind w:left="14"/>
               <w:jc w:val="center"/>
               <w:rPr>
@@ -5509,6 +5400,7 @@
         <w:tc>
           <w:tcPr>
             <w:tcW w:w="1446" w:type="dxa"/>
+            <w:vAlign w:val="center"/>
           </w:tcPr>
           <w:p>
             <w:pPr>
@@ -5526,11 +5418,11 @@
         <w:tc>
           <w:tcPr>
             <w:tcW w:w="1450" w:type="dxa"/>
-          </w:tcPr>
-          <w:p>
-            <w:pPr>
-              <w:pStyle w:val="TableParagraph"/>
-              <w:spacing w:before="35"/>
+            <w:vAlign w:val="center"/>
+          </w:tcPr>
+          <w:p>
+            <w:pPr>
+              <w:pStyle w:val="TableParagraph"/>
               <w:ind w:left="15"/>
               <w:jc w:val="center"/>
               <w:rPr>
@@ -5556,11 +5448,11 @@
         <w:tc>
           <w:tcPr>
             <w:tcW w:w="485" w:type="dxa"/>
-          </w:tcPr>
-          <w:p>
-            <w:pPr>
-              <w:pStyle w:val="TableParagraph"/>
-              <w:spacing w:before="35"/>
+            <w:vAlign w:val="center"/>
+          </w:tcPr>
+          <w:p>
+            <w:pPr>
+              <w:pStyle w:val="TableParagraph"/>
               <w:ind w:left="15" w:right="1"/>
               <w:jc w:val="center"/>
               <w:rPr>
@@ -5581,11 +5473,11 @@
         <w:tc>
           <w:tcPr>
             <w:tcW w:w="2846" w:type="dxa"/>
-          </w:tcPr>
-          <w:p>
-            <w:pPr>
-              <w:pStyle w:val="TableParagraph"/>
-              <w:spacing w:before="35"/>
+            <w:vAlign w:val="center"/>
+          </w:tcPr>
+          <w:p>
+            <w:pPr>
+              <w:pStyle w:val="TableParagraph"/>
               <w:ind w:left="22"/>
               <w:rPr>
                 <w:sz w:val="26"/>
@@ -5616,6 +5508,7 @@
             <w:tcBorders>
               <w:top w:val="nil"/>
             </w:tcBorders>
+            <w:vAlign w:val="center"/>
           </w:tcPr>
           <w:p>
             <w:pPr>
@@ -5629,11 +5522,11 @@
         <w:tc>
           <w:tcPr>
             <w:tcW w:w="1428" w:type="dxa"/>
-          </w:tcPr>
-          <w:p>
-            <w:pPr>
-              <w:pStyle w:val="TableParagraph"/>
-              <w:spacing w:before="35"/>
+            <w:vAlign w:val="center"/>
+          </w:tcPr>
+          <w:p>
+            <w:pPr>
+              <w:pStyle w:val="TableParagraph"/>
               <w:ind w:left="14"/>
               <w:jc w:val="center"/>
               <w:rPr>
@@ -5654,11 +5547,11 @@
         <w:tc>
           <w:tcPr>
             <w:tcW w:w="1426" w:type="dxa"/>
-          </w:tcPr>
-          <w:p>
-            <w:pPr>
-              <w:pStyle w:val="TableParagraph"/>
-              <w:spacing w:before="35"/>
+            <w:vAlign w:val="center"/>
+          </w:tcPr>
+          <w:p>
+            <w:pPr>
+              <w:pStyle w:val="TableParagraph"/>
               <w:ind w:left="14"/>
               <w:jc w:val="center"/>
               <w:rPr>
@@ -5678,6 +5571,7 @@
         <w:tc>
           <w:tcPr>
             <w:tcW w:w="1446" w:type="dxa"/>
+            <w:vAlign w:val="center"/>
           </w:tcPr>
           <w:p>
             <w:pPr>
@@ -5695,11 +5589,11 @@
         <w:tc>
           <w:tcPr>
             <w:tcW w:w="1450" w:type="dxa"/>
-          </w:tcPr>
-          <w:p>
-            <w:pPr>
-              <w:pStyle w:val="TableParagraph"/>
-              <w:spacing w:before="35"/>
+            <w:vAlign w:val="center"/>
+          </w:tcPr>
+          <w:p>
+            <w:pPr>
+              <w:pStyle w:val="TableParagraph"/>
               <w:ind w:left="15"/>
               <w:jc w:val="center"/>
               <w:rPr>
@@ -5725,11 +5619,11 @@
         <w:tc>
           <w:tcPr>
             <w:tcW w:w="485" w:type="dxa"/>
-          </w:tcPr>
-          <w:p>
-            <w:pPr>
-              <w:pStyle w:val="TableParagraph"/>
-              <w:spacing w:before="35"/>
+            <w:vAlign w:val="center"/>
+          </w:tcPr>
+          <w:p>
+            <w:pPr>
+              <w:pStyle w:val="TableParagraph"/>
               <w:ind w:left="15" w:right="1"/>
               <w:jc w:val="center"/>
               <w:rPr>
@@ -5750,11 +5644,11 @@
         <w:tc>
           <w:tcPr>
             <w:tcW w:w="2846" w:type="dxa"/>
-          </w:tcPr>
-          <w:p>
-            <w:pPr>
-              <w:pStyle w:val="TableParagraph"/>
-              <w:spacing w:before="35"/>
+            <w:vAlign w:val="center"/>
+          </w:tcPr>
+          <w:p>
+            <w:pPr>
+              <w:pStyle w:val="TableParagraph"/>
               <w:ind w:left="22"/>
               <w:rPr>
                 <w:sz w:val="26"/>
@@ -5793,6 +5687,7 @@
             <w:tcBorders>
               <w:top w:val="nil"/>
             </w:tcBorders>
+            <w:vAlign w:val="center"/>
           </w:tcPr>
           <w:p>
             <w:pPr>
@@ -5806,11 +5701,11 @@
         <w:tc>
           <w:tcPr>
             <w:tcW w:w="1428" w:type="dxa"/>
-          </w:tcPr>
-          <w:p>
-            <w:pPr>
-              <w:pStyle w:val="TableParagraph"/>
-              <w:spacing w:before="35"/>
+            <w:vAlign w:val="center"/>
+          </w:tcPr>
+          <w:p>
+            <w:pPr>
+              <w:pStyle w:val="TableParagraph"/>
               <w:ind w:left="14"/>
               <w:jc w:val="center"/>
               <w:rPr>
@@ -5831,11 +5726,11 @@
         <w:tc>
           <w:tcPr>
             <w:tcW w:w="1426" w:type="dxa"/>
-          </w:tcPr>
-          <w:p>
-            <w:pPr>
-              <w:pStyle w:val="TableParagraph"/>
-              <w:spacing w:before="35"/>
+            <w:vAlign w:val="center"/>
+          </w:tcPr>
+          <w:p>
+            <w:pPr>
+              <w:pStyle w:val="TableParagraph"/>
               <w:ind w:left="14"/>
               <w:jc w:val="center"/>
               <w:rPr>
@@ -5855,6 +5750,7 @@
         <w:tc>
           <w:tcPr>
             <w:tcW w:w="1446" w:type="dxa"/>
+            <w:vAlign w:val="center"/>
           </w:tcPr>
           <w:p>
             <w:pPr>
@@ -5872,11 +5768,11 @@
         <w:tc>
           <w:tcPr>
             <w:tcW w:w="1450" w:type="dxa"/>
-          </w:tcPr>
-          <w:p>
-            <w:pPr>
-              <w:pStyle w:val="TableParagraph"/>
-              <w:spacing w:before="35"/>
+            <w:vAlign w:val="center"/>
+          </w:tcPr>
+          <w:p>
+            <w:pPr>
+              <w:pStyle w:val="TableParagraph"/>
               <w:ind w:left="15"/>
               <w:jc w:val="center"/>
               <w:rPr>
@@ -5902,11 +5798,11 @@
         <w:tc>
           <w:tcPr>
             <w:tcW w:w="485" w:type="dxa"/>
-          </w:tcPr>
-          <w:p>
-            <w:pPr>
-              <w:pStyle w:val="TableParagraph"/>
-              <w:spacing w:before="35"/>
+            <w:vAlign w:val="center"/>
+          </w:tcPr>
+          <w:p>
+            <w:pPr>
+              <w:pStyle w:val="TableParagraph"/>
               <w:ind w:left="15" w:right="1"/>
               <w:jc w:val="center"/>
               <w:rPr>
@@ -5927,11 +5823,11 @@
         <w:tc>
           <w:tcPr>
             <w:tcW w:w="2846" w:type="dxa"/>
-          </w:tcPr>
-          <w:p>
-            <w:pPr>
-              <w:pStyle w:val="TableParagraph"/>
-              <w:spacing w:before="35"/>
+            <w:vAlign w:val="center"/>
+          </w:tcPr>
+          <w:p>
+            <w:pPr>
+              <w:pStyle w:val="TableParagraph"/>
               <w:ind w:left="22"/>
               <w:rPr>
                 <w:sz w:val="26"/>
@@ -5962,6 +5858,7 @@
             <w:tcBorders>
               <w:top w:val="nil"/>
             </w:tcBorders>
+            <w:vAlign w:val="center"/>
           </w:tcPr>
           <w:p>
             <w:pPr>
@@ -5975,11 +5872,11 @@
         <w:tc>
           <w:tcPr>
             <w:tcW w:w="1428" w:type="dxa"/>
-          </w:tcPr>
-          <w:p>
-            <w:pPr>
-              <w:pStyle w:val="TableParagraph"/>
-              <w:spacing w:before="35"/>
+            <w:vAlign w:val="center"/>
+          </w:tcPr>
+          <w:p>
+            <w:pPr>
+              <w:pStyle w:val="TableParagraph"/>
               <w:ind w:left="14"/>
               <w:jc w:val="center"/>
               <w:rPr>
@@ -5987,11 +5884,20 @@
                 <w:szCs w:val="26"/>
               </w:rPr>
             </w:pPr>
+            <w:r>
+              <w:rPr>
+                <w:spacing w:val="-2"/>
+                <w:sz w:val="26"/>
+                <w:szCs w:val="26"/>
+              </w:rPr>
+              <w:t>{n2_kq}</w:t>
+            </w:r>
           </w:p>
         </w:tc>
         <w:tc>
           <w:tcPr>
             <w:tcW w:w="1426" w:type="dxa"/>
+            <w:vAlign w:val="center"/>
           </w:tcPr>
           <w:p>
             <w:pPr>
@@ -6006,6 +5912,7 @@
         <w:tc>
           <w:tcPr>
             <w:tcW w:w="1446" w:type="dxa"/>
+            <w:vAlign w:val="center"/>
           </w:tcPr>
           <w:p>
             <w:pPr>
@@ -6020,6 +5927,7 @@
         <w:tc>
           <w:tcPr>
             <w:tcW w:w="1450" w:type="dxa"/>
+            <w:vAlign w:val="center"/>
           </w:tcPr>
           <w:p>
             <w:pPr>
@@ -6039,11 +5947,11 @@
         <w:tc>
           <w:tcPr>
             <w:tcW w:w="485" w:type="dxa"/>
-          </w:tcPr>
-          <w:p>
-            <w:pPr>
-              <w:pStyle w:val="TableParagraph"/>
-              <w:spacing w:before="35"/>
+            <w:vAlign w:val="center"/>
+          </w:tcPr>
+          <w:p>
+            <w:pPr>
+              <w:pStyle w:val="TableParagraph"/>
               <w:ind w:left="15" w:right="1"/>
               <w:jc w:val="center"/>
               <w:rPr>
@@ -6064,11 +5972,11 @@
         <w:tc>
           <w:tcPr>
             <w:tcW w:w="2846" w:type="dxa"/>
-          </w:tcPr>
-          <w:p>
-            <w:pPr>
-              <w:pStyle w:val="TableParagraph"/>
-              <w:spacing w:before="35"/>
+            <w:vAlign w:val="center"/>
+          </w:tcPr>
+          <w:p>
+            <w:pPr>
+              <w:pStyle w:val="TableParagraph"/>
               <w:ind w:left="22"/>
               <w:rPr>
                 <w:sz w:val="26"/>
@@ -6099,6 +6007,7 @@
             <w:tcBorders>
               <w:top w:val="nil"/>
             </w:tcBorders>
+            <w:vAlign w:val="center"/>
           </w:tcPr>
           <w:p>
             <w:pPr>
@@ -6112,11 +6021,11 @@
         <w:tc>
           <w:tcPr>
             <w:tcW w:w="1428" w:type="dxa"/>
-          </w:tcPr>
-          <w:p>
-            <w:pPr>
-              <w:pStyle w:val="TableParagraph"/>
-              <w:spacing w:before="35"/>
+            <w:vAlign w:val="center"/>
+          </w:tcPr>
+          <w:p>
+            <w:pPr>
+              <w:pStyle w:val="TableParagraph"/>
               <w:ind w:left="14"/>
               <w:jc w:val="center"/>
               <w:rPr>
@@ -6124,11 +6033,20 @@
                 <w:szCs w:val="26"/>
               </w:rPr>
             </w:pPr>
+            <w:r>
+              <w:rPr>
+                <w:spacing w:val="-2"/>
+                <w:sz w:val="26"/>
+                <w:szCs w:val="26"/>
+              </w:rPr>
+              <w:t>{o2_kq}</w:t>
+            </w:r>
           </w:p>
         </w:tc>
         <w:tc>
           <w:tcPr>
             <w:tcW w:w="1426" w:type="dxa"/>
+            <w:vAlign w:val="center"/>
           </w:tcPr>
           <w:p>
             <w:pPr>
@@ -6143,6 +6061,7 @@
         <w:tc>
           <w:tcPr>
             <w:tcW w:w="1446" w:type="dxa"/>
+            <w:vAlign w:val="center"/>
           </w:tcPr>
           <w:p>
             <w:pPr>
@@ -6157,6 +6076,7 @@
         <w:tc>
           <w:tcPr>
             <w:tcW w:w="1450" w:type="dxa"/>
+            <w:vAlign w:val="center"/>
           </w:tcPr>
           <w:p>
             <w:pPr>
@@ -6176,11 +6096,11 @@
         <w:tc>
           <w:tcPr>
             <w:tcW w:w="485" w:type="dxa"/>
-          </w:tcPr>
-          <w:p>
-            <w:pPr>
-              <w:pStyle w:val="TableParagraph"/>
-              <w:spacing w:before="148"/>
+            <w:vAlign w:val="center"/>
+          </w:tcPr>
+          <w:p>
+            <w:pPr>
+              <w:pStyle w:val="TableParagraph"/>
               <w:ind w:left="15"/>
               <w:jc w:val="center"/>
               <w:rPr>
@@ -6201,11 +6121,11 @@
         <w:tc>
           <w:tcPr>
             <w:tcW w:w="2846" w:type="dxa"/>
-          </w:tcPr>
-          <w:p>
-            <w:pPr>
-              <w:pStyle w:val="TableParagraph"/>
-              <w:spacing w:before="22"/>
+            <w:vAlign w:val="center"/>
+          </w:tcPr>
+          <w:p>
+            <w:pPr>
+              <w:pStyle w:val="TableParagraph"/>
               <w:ind w:left="22"/>
               <w:rPr>
                 <w:sz w:val="26"/>
@@ -6296,6 +6216,7 @@
             <w:tcBorders>
               <w:top w:val="nil"/>
             </w:tcBorders>
+            <w:vAlign w:val="center"/>
           </w:tcPr>
           <w:p>
             <w:pPr>
@@ -6309,11 +6230,11 @@
         <w:tc>
           <w:tcPr>
             <w:tcW w:w="1428" w:type="dxa"/>
-          </w:tcPr>
-          <w:p>
-            <w:pPr>
-              <w:pStyle w:val="TableParagraph"/>
-              <w:spacing w:before="148"/>
+            <w:vAlign w:val="center"/>
+          </w:tcPr>
+          <w:p>
+            <w:pPr>
+              <w:pStyle w:val="TableParagraph"/>
               <w:ind w:left="14"/>
               <w:jc w:val="center"/>
               <w:rPr>
@@ -6334,6 +6255,7 @@
         <w:tc>
           <w:tcPr>
             <w:tcW w:w="1426" w:type="dxa"/>
+            <w:vAlign w:val="center"/>
           </w:tcPr>
           <w:p>
             <w:pPr>
@@ -6348,6 +6270,7 @@
         <w:tc>
           <w:tcPr>
             <w:tcW w:w="1446" w:type="dxa"/>
+            <w:vAlign w:val="center"/>
           </w:tcPr>
           <w:p>
             <w:pPr>
@@ -6365,6 +6288,7 @@
         <w:tc>
           <w:tcPr>
             <w:tcW w:w="1450" w:type="dxa"/>
+            <w:vAlign w:val="center"/>
           </w:tcPr>
           <w:p>
             <w:pPr>
@@ -6384,11 +6308,11 @@
         <w:tc>
           <w:tcPr>
             <w:tcW w:w="485" w:type="dxa"/>
-          </w:tcPr>
-          <w:p>
-            <w:pPr>
-              <w:pStyle w:val="TableParagraph"/>
-              <w:spacing w:before="148"/>
+            <w:vAlign w:val="center"/>
+          </w:tcPr>
+          <w:p>
+            <w:pPr>
+              <w:pStyle w:val="TableParagraph"/>
               <w:ind w:left="15"/>
               <w:jc w:val="center"/>
               <w:rPr>
@@ -6409,11 +6333,11 @@
         <w:tc>
           <w:tcPr>
             <w:tcW w:w="2846" w:type="dxa"/>
-          </w:tcPr>
-          <w:p>
-            <w:pPr>
-              <w:pStyle w:val="TableParagraph"/>
-              <w:spacing w:before="22"/>
+            <w:vAlign w:val="center"/>
+          </w:tcPr>
+          <w:p>
+            <w:pPr>
+              <w:pStyle w:val="TableParagraph"/>
               <w:ind w:left="22"/>
               <w:rPr>
                 <w:sz w:val="26"/>
@@ -6487,6 +6411,7 @@
             <w:tcBorders>
               <w:top w:val="nil"/>
             </w:tcBorders>
+            <w:vAlign w:val="center"/>
           </w:tcPr>
           <w:p>
             <w:pPr>
@@ -6500,34 +6425,55 @@
         <w:tc>
           <w:tcPr>
             <w:tcW w:w="1428" w:type="dxa"/>
-          </w:tcPr>
-          <w:p>
-            <w:pPr>
-              <w:pStyle w:val="TableParagraph"/>
-              <w:rPr>
-                <w:sz w:val="26"/>
-                <w:szCs w:val="26"/>
-              </w:rPr>
-            </w:pPr>
+            <w:vAlign w:val="center"/>
+          </w:tcPr>
+          <w:p>
+            <w:pPr>
+              <w:pStyle w:val="TableParagraph"/>
+              <w:jc w:val="center"/>
+              <w:rPr>
+                <w:sz w:val="26"/>
+                <w:szCs w:val="26"/>
+              </w:rPr>
+            </w:pPr>
+            <w:r>
+              <w:rPr>
+                <w:spacing w:val="-2"/>
+                <w:sz w:val="26"/>
+                <w:szCs w:val="26"/>
+              </w:rPr>
+              <w:t>{tonghamluongkhi_kq}</w:t>
+            </w:r>
           </w:p>
         </w:tc>
         <w:tc>
           <w:tcPr>
             <w:tcW w:w="1426" w:type="dxa"/>
-          </w:tcPr>
-          <w:p>
-            <w:pPr>
-              <w:pStyle w:val="TableParagraph"/>
-              <w:rPr>
-                <w:sz w:val="26"/>
-                <w:szCs w:val="26"/>
-              </w:rPr>
-            </w:pPr>
+            <w:vAlign w:val="center"/>
+          </w:tcPr>
+          <w:p>
+            <w:pPr>
+              <w:pStyle w:val="TableParagraph"/>
+              <w:jc w:val="center"/>
+              <w:rPr>
+                <w:sz w:val="26"/>
+                <w:szCs w:val="26"/>
+              </w:rPr>
+            </w:pPr>
+            <w:r>
+              <w:rPr>
+                <w:spacing w:val="-2"/>
+                <w:sz w:val="26"/>
+                <w:szCs w:val="26"/>
+              </w:rPr>
+              <w:t>{tonghamluongkhi_tc}</w:t>
+            </w:r>
           </w:p>
         </w:tc>
         <w:tc>
           <w:tcPr>
             <w:tcW w:w="1446" w:type="dxa"/>
+            <w:vAlign w:val="center"/>
           </w:tcPr>
           <w:p>
             <w:pPr>
@@ -6542,15 +6488,25 @@
         <w:tc>
           <w:tcPr>
             <w:tcW w:w="1450" w:type="dxa"/>
-          </w:tcPr>
-          <w:p>
-            <w:pPr>
-              <w:pStyle w:val="TableParagraph"/>
-              <w:rPr>
-                <w:sz w:val="26"/>
-                <w:szCs w:val="26"/>
-              </w:rPr>
-            </w:pPr>
+            <w:vAlign w:val="center"/>
+          </w:tcPr>
+          <w:p>
+            <w:pPr>
+              <w:pStyle w:val="TableParagraph"/>
+              <w:jc w:val="center"/>
+              <w:rPr>
+                <w:sz w:val="26"/>
+                <w:szCs w:val="26"/>
+              </w:rPr>
+            </w:pPr>
+            <w:r>
+              <w:rPr>
+                <w:spacing w:val="-2"/>
+                <w:sz w:val="26"/>
+                <w:szCs w:val="26"/>
+              </w:rPr>
+              <w:t>{tonghamluongkhi_dg}</w:t>
+            </w:r>
           </w:p>
         </w:tc>
       </w:tr>
@@ -6883,7 +6839,7 @@
         </w:tabs>
         <w:sectPr>
           <w:pgSz w:w="11910" w:h="16840"/>
-          <w:pgMar w:top="567" w:right="708" w:bottom="567" w:left="992" w:header="366" w:footer="334" w:gutter="0"/>
+          <w:pgMar w:top="940" w:right="708" w:bottom="520" w:left="992" w:header="366" w:footer="334" w:gutter="0"/>
           <w:cols w:space="720"/>
         </w:sectPr>
       </w:pPr>
@@ -6919,7 +6875,7 @@
           <w:headerReference w:type="default" r:id="rId9"/>
           <w:footerReference w:type="default" r:id="rId10"/>
           <w:pgSz w:w="11910" w:h="16840"/>
-          <w:pgMar w:top="567" w:right="708" w:bottom="567" w:left="992" w:header="366" w:footer="334" w:gutter="0"/>
+          <w:pgMar w:top="620" w:right="708" w:bottom="520" w:left="992" w:header="366" w:footer="334" w:gutter="0"/>
           <w:cols w:num="2" w:space="720" w:equalWidth="0">
             <w:col w:w="1028" w:space="5534"/>
             <w:col w:w="3648"/>
@@ -6990,7 +6946,7 @@
     <w:sectPr>
       <w:type w:val="continuous"/>
       <w:pgSz w:w="11910" w:h="16840"/>
-      <w:pgMar w:top="567" w:right="708" w:bottom="567" w:left="992" w:header="366" w:footer="334" w:gutter="0"/>
+      <w:pgMar w:top="940" w:right="708" w:bottom="520" w:left="992" w:header="366" w:footer="334" w:gutter="0"/>
       <w:cols w:space="720"/>
     </w:sectPr>
   </w:body>
@@ -7034,13 +6990,13 @@
       <mc:AlternateContent>
         <mc:Choice Requires="wps">
           <w:drawing>
-            <wp:anchor distT="0" distB="0" distL="0" distR="0" simplePos="0" relativeHeight="251658240" behindDoc="1" locked="0" layoutInCell="1" allowOverlap="1" wp14:anchorId="4D7D8A47" wp14:editId="0180CBE5">
+            <wp:anchor distT="0" distB="0" distL="0" distR="0" simplePos="0" relativeHeight="487331328" behindDoc="1" locked="0" layoutInCell="1" allowOverlap="1" wp14:anchorId="4D7D8A47" wp14:editId="642EB2E3">
               <wp:simplePos x="0" y="0"/>
               <wp:positionH relativeFrom="page">
-                <wp:posOffset>3625850</wp:posOffset>
+                <wp:posOffset>3626103</wp:posOffset>
               </wp:positionH>
               <wp:positionV relativeFrom="page">
-                <wp:posOffset>10398067</wp:posOffset>
+                <wp:posOffset>10340424</wp:posOffset>
               </wp:positionV>
               <wp:extent cx="622300" cy="194310"/>
               <wp:effectExtent l="0" t="0" r="0" b="0"/>
@@ -7138,7 +7094,7 @@
               <v:stroke joinstyle="miter"/>
               <v:path gradientshapeok="t" o:connecttype="rect"/>
             </v:shapetype>
-            <v:shape id="Textbox 2" o:spid="_x0000_s1027" type="#_x0000_t202" style="position:absolute;margin-left:285.5pt;margin-top:818.75pt;width:49pt;height:15.3pt;z-index:-251658240;visibility:visible;mso-wrap-style:square;mso-wrap-distance-left:0;mso-wrap-distance-top:0;mso-wrap-distance-right:0;mso-wrap-distance-bottom:0;mso-position-horizontal:absolute;mso-position-horizontal-relative:page;mso-position-vertical:absolute;mso-position-vertical-relative:page;v-text-anchor:top" o:gfxdata="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" filled="f" stroked="f">
+            <v:shape id="Textbox 2" o:spid="_x0000_s1027" type="#_x0000_t202" style="position:absolute;margin-left:285.5pt;margin-top:814.2pt;width:49pt;height:15.3pt;z-index:-15985152;visibility:visible;mso-wrap-style:square;mso-wrap-distance-left:0;mso-wrap-distance-top:0;mso-wrap-distance-right:0;mso-wrap-distance-bottom:0;mso-position-horizontal:absolute;mso-position-horizontal-relative:page;mso-position-vertical:absolute;mso-position-vertical-relative:page;v-text-anchor:top" o:gfxdata="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" filled="f" stroked="f">
               <v:textbox inset="0,0,0,0">
                 <w:txbxContent>
                   <w:p>
@@ -7226,7 +7182,7 @@
       <mc:AlternateContent>
         <mc:Choice Requires="wps">
           <w:drawing>
-            <wp:anchor distT="0" distB="0" distL="0" distR="0" simplePos="0" relativeHeight="251660288" behindDoc="1" locked="0" layoutInCell="1" allowOverlap="1" wp14:anchorId="31EF6E07" wp14:editId="495CC587">
+            <wp:anchor distT="0" distB="0" distL="0" distR="0" simplePos="0" relativeHeight="487332352" behindDoc="1" locked="0" layoutInCell="1" allowOverlap="1" wp14:anchorId="31EF6E07" wp14:editId="495CC587">
               <wp:simplePos x="0" y="0"/>
               <wp:positionH relativeFrom="page">
                 <wp:posOffset>3626103</wp:posOffset>
@@ -7330,7 +7286,7 @@
               <v:stroke joinstyle="miter"/>
               <v:path gradientshapeok="t" o:connecttype="rect"/>
             </v:shapetype>
-            <v:shape id="Textbox 13" o:spid="_x0000_s1029" type="#_x0000_t202" style="position:absolute;margin-left:285.5pt;margin-top:814.2pt;width:49pt;height:15.3pt;z-index:-251656192;visibility:visible;mso-wrap-style:square;mso-wrap-distance-left:0;mso-wrap-distance-top:0;mso-wrap-distance-right:0;mso-wrap-distance-bottom:0;mso-position-horizontal:absolute;mso-position-horizontal-relative:page;mso-position-vertical:absolute;mso-position-vertical-relative:page;v-text-anchor:top" o:gfxdata="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" filled="f" stroked="f">
+            <v:shape id="Textbox 13" o:spid="_x0000_s1029" type="#_x0000_t202" style="position:absolute;margin-left:285.5pt;margin-top:814.2pt;width:49pt;height:15.3pt;z-index:-15984128;visibility:visible;mso-wrap-style:square;mso-wrap-distance-left:0;mso-wrap-distance-top:0;mso-wrap-distance-right:0;mso-wrap-distance-bottom:0;mso-position-horizontal:absolute;mso-position-horizontal-relative:page;mso-position-vertical:absolute;mso-position-vertical-relative:page;v-text-anchor:top" o:gfxdata="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" filled="f" stroked="f">
               <v:textbox inset="0,0,0,0">
                 <w:txbxContent>
                   <w:p>
@@ -7437,15 +7393,15 @@
       <mc:AlternateContent>
         <mc:Choice Requires="wps">
           <w:drawing>
-            <wp:anchor distT="0" distB="0" distL="0" distR="0" simplePos="0" relativeHeight="251656192" behindDoc="1" locked="0" layoutInCell="1" allowOverlap="1" wp14:anchorId="62176524" wp14:editId="1D1DA9A3">
+            <wp:anchor distT="0" distB="0" distL="0" distR="0" simplePos="0" relativeHeight="487330816" behindDoc="1" locked="0" layoutInCell="1" allowOverlap="1" wp14:anchorId="62176524" wp14:editId="369000DA">
               <wp:simplePos x="0" y="0"/>
               <wp:positionH relativeFrom="page">
-                <wp:posOffset>4876800</wp:posOffset>
+                <wp:posOffset>4877942</wp:posOffset>
               </wp:positionH>
               <wp:positionV relativeFrom="page">
-                <wp:posOffset>55418</wp:posOffset>
+                <wp:posOffset>219794</wp:posOffset>
               </wp:positionV>
-              <wp:extent cx="2222500" cy="380481"/>
+              <wp:extent cx="2222500" cy="397510"/>
               <wp:effectExtent l="0" t="0" r="0" b="0"/>
               <wp:wrapNone/>
               <wp:docPr id="1" name="Textbox 1"/>
@@ -7461,7 +7417,7 @@
                     <wps:spPr>
                       <a:xfrm>
                         <a:off x="0" y="0"/>
-                        <a:ext cx="2222500" cy="380481"/>
+                        <a:ext cx="2222500" cy="397510"/>
                       </a:xfrm>
                       <a:prstGeom prst="rect">
                         <a:avLst/>
@@ -7471,7 +7427,8 @@
                       <w:txbxContent>
                         <w:p>
                           <w:pPr>
-                            <w:ind w:left="2177"/>
+                            <w:spacing w:before="10"/>
+                            <w:ind w:left="2178"/>
                             <w:rPr>
                               <w:b/>
                               <w:sz w:val="24"/>
@@ -7492,19 +7449,16 @@
                             <w:pStyle w:val="BodyText"/>
                             <w:spacing w:before="44"/>
                             <w:ind w:left="20"/>
-                            <w:rPr>
-                              <w:color w:val="000000" w:themeColor="text1"/>
-                            </w:rPr>
                           </w:pPr>
                           <w:r>
                             <w:rPr>
-                              <w:color w:val="000000" w:themeColor="text1"/>
+                              <w:color w:val="7F7F7F"/>
                             </w:rPr>
                             <w:t>Số:</w:t>
                           </w:r>
                           <w:r>
                             <w:rPr>
-                              <w:color w:val="000000" w:themeColor="text1"/>
+                              <w:color w:val="7F7F7F"/>
                               <w:spacing w:val="-7"/>
                             </w:rPr>
                             <w:t xml:space="preserve"> </w:t>
@@ -7518,9 +7472,6 @@
                   </wps:wsp>
                 </a:graphicData>
               </a:graphic>
-              <wp14:sizeRelV relativeFrom="margin">
-                <wp14:pctHeight>0</wp14:pctHeight>
-              </wp14:sizeRelV>
             </wp:anchor>
           </w:drawing>
         </mc:Choice>
@@ -7530,12 +7481,13 @@
               <v:stroke joinstyle="miter"/>
               <v:path gradientshapeok="t" o:connecttype="rect"/>
             </v:shapetype>
-            <v:shape id="Textbox 1" o:spid="_x0000_s1026" type="#_x0000_t202" style="position:absolute;margin-left:384pt;margin-top:4.35pt;width:175pt;height:29.95pt;z-index:-251660288;visibility:visible;mso-wrap-style:square;mso-height-percent:0;mso-wrap-distance-left:0;mso-wrap-distance-top:0;mso-wrap-distance-right:0;mso-wrap-distance-bottom:0;mso-position-horizontal:absolute;mso-position-horizontal-relative:page;mso-position-vertical:absolute;mso-position-vertical-relative:page;mso-height-percent:0;mso-height-relative:margin;v-text-anchor:top" o:gfxdata="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" filled="f" stroked="f">
+            <v:shape id="Textbox 1" o:spid="_x0000_s1026" type="#_x0000_t202" style="position:absolute;margin-left:384.1pt;margin-top:17.3pt;width:175pt;height:31.3pt;z-index:-15985664;visibility:visible;mso-wrap-style:square;mso-wrap-distance-left:0;mso-wrap-distance-top:0;mso-wrap-distance-right:0;mso-wrap-distance-bottom:0;mso-position-horizontal:absolute;mso-position-horizontal-relative:page;mso-position-vertical:absolute;mso-position-vertical-relative:page;v-text-anchor:top" o:gfxdata="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" filled="f" stroked="f">
               <v:textbox inset="0,0,0,0">
                 <w:txbxContent>
                   <w:p>
                     <w:pPr>
-                      <w:ind w:left="2177"/>
+                      <w:spacing w:before="10"/>
+                      <w:ind w:left="2178"/>
                       <w:rPr>
                         <w:b/>
                         <w:sz w:val="24"/>
@@ -7556,19 +7508,16 @@
                       <w:pStyle w:val="BodyText"/>
                       <w:spacing w:before="44"/>
                       <w:ind w:left="20"/>
-                      <w:rPr>
-                        <w:color w:val="000000" w:themeColor="text1"/>
-                      </w:rPr>
                     </w:pPr>
                     <w:r>
                       <w:rPr>
-                        <w:color w:val="000000" w:themeColor="text1"/>
+                        <w:color w:val="7F7F7F"/>
                       </w:rPr>
                       <w:t>Số:</w:t>
                     </w:r>
                     <w:r>
                       <w:rPr>
-                        <w:color w:val="000000" w:themeColor="text1"/>
+                        <w:color w:val="7F7F7F"/>
                         <w:spacing w:val="-7"/>
                       </w:rPr>
                       <w:t xml:space="preserve"> </w:t>
@@ -7604,7 +7553,7 @@
       <mc:AlternateContent>
         <mc:Choice Requires="wps">
           <w:drawing>
-            <wp:anchor distT="0" distB="0" distL="0" distR="0" simplePos="0" relativeHeight="251659264" behindDoc="1" locked="0" layoutInCell="1" allowOverlap="1" wp14:anchorId="6E919A49" wp14:editId="62D8CAF8">
+            <wp:anchor distT="0" distB="0" distL="0" distR="0" simplePos="0" relativeHeight="487331840" behindDoc="1" locked="0" layoutInCell="1" allowOverlap="1" wp14:anchorId="6E919A49" wp14:editId="62D8CAF8">
               <wp:simplePos x="0" y="0"/>
               <wp:positionH relativeFrom="page">
                 <wp:posOffset>6248780</wp:posOffset>
@@ -7672,7 +7621,7 @@
               <v:stroke joinstyle="miter"/>
               <v:path gradientshapeok="t" o:connecttype="rect"/>
             </v:shapetype>
-            <v:shape id="Textbox 12" o:spid="_x0000_s1028" type="#_x0000_t202" style="position:absolute;margin-left:492.05pt;margin-top:17.3pt;width:67.05pt;height:15.3pt;z-index:-251657216;visibility:visible;mso-wrap-style:square;mso-wrap-distance-left:0;mso-wrap-distance-top:0;mso-wrap-distance-right:0;mso-wrap-distance-bottom:0;mso-position-horizontal:absolute;mso-position-horizontal-relative:page;mso-position-vertical:absolute;mso-position-vertical-relative:page;v-text-anchor:top" o:gfxdata="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" filled="f" stroked="f">
+            <v:shape id="Textbox 12" o:spid="_x0000_s1028" type="#_x0000_t202" style="position:absolute;margin-left:492.05pt;margin-top:17.3pt;width:67.05pt;height:15.3pt;z-index:-15984640;visibility:visible;mso-wrap-style:square;mso-wrap-distance-left:0;mso-wrap-distance-top:0;mso-wrap-distance-right:0;mso-wrap-distance-bottom:0;mso-position-horizontal:absolute;mso-position-horizontal-relative:page;mso-position-vertical:absolute;mso-position-vertical-relative:page;v-text-anchor:top" o:gfxdata="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" filled="f" stroked="f">
               <v:textbox inset="0,0,0,0">
                 <w:txbxContent>
                   <w:p>

</xml_diff>